<commit_message>
updated the docs and README.md
</commit_message>
<xml_diff>
--- a/Python_Server/Sessions/mini-quiz-game-mongodb-flask-sessions/docs/python-backend.docx
+++ b/Python_Server/Sessions/mini-quiz-game-mongodb-flask-sessions/docs/python-backend.docx
@@ -186,7 +186,7 @@
               <w:rPr>
                 <w:rStyle w:val="SourceText"/>
               </w:rPr>
-              <w:t>backend/logic/api_response.py</w:t>
+              <w:t>backend/logic/common/api_response.py</w:t>
             </w:r>
           </w:p>
         </w:tc>
@@ -231,7 +231,7 @@
               <w:rPr>
                 <w:rStyle w:val="SourceText"/>
               </w:rPr>
-              <w:t>backend/logic/generic_api.py</w:t>
+              <w:t>backend/logic/common/generic_api.py</w:t>
             </w:r>
           </w:p>
         </w:tc>
@@ -276,7 +276,7 @@
               <w:rPr>
                 <w:rStyle w:val="SourceText"/>
               </w:rPr>
-              <w:t>backend/logic/registration_api.py</w:t>
+              <w:t>backend/logic/auth/registration_api.py</w:t>
             </w:r>
           </w:p>
         </w:tc>
@@ -321,7 +321,7 @@
               <w:rPr>
                 <w:rStyle w:val="SourceText"/>
               </w:rPr>
-              <w:t>backend/logic/authentication_api.py</w:t>
+              <w:t>backend/logic/auth/authentication_api.py</w:t>
             </w:r>
           </w:p>
         </w:tc>
@@ -366,7 +366,7 @@
               <w:rPr>
                 <w:rStyle w:val="SourceText"/>
               </w:rPr>
-              <w:t>backend/logic/generic_crud.py</w:t>
+              <w:t>backend/logic/common/generic_crud.py</w:t>
             </w:r>
           </w:p>
         </w:tc>
@@ -411,7 +411,7 @@
               <w:rPr>
                 <w:rStyle w:val="SourceText"/>
               </w:rPr>
-              <w:t>backend/logic/user_logic.py</w:t>
+              <w:t>backend/logic/users/user_logic.py</w:t>
             </w:r>
           </w:p>
         </w:tc>
@@ -456,7 +456,7 @@
               <w:rPr>
                 <w:rStyle w:val="SourceText"/>
               </w:rPr>
-              <w:t>backend/logic/user_registration.py</w:t>
+              <w:t>backend/logic/users/user_registration.py</w:t>
             </w:r>
           </w:p>
         </w:tc>
@@ -476,7 +476,7 @@
             </w:pPr>
             <w:r>
               <w:rPr/>
-              <w:t>Email/password validation, registration, authentication, profile lookup, and admin-role lookup.</w:t>
+              <w:t>Email/password validation, registration, authentication, profiles, quiz attempts, and admin roles.</w:t>
             </w:r>
           </w:p>
         </w:tc>
@@ -501,7 +501,7 @@
               <w:rPr>
                 <w:rStyle w:val="SourceText"/>
               </w:rPr>
-              <w:t>backend/logic/quiz_logic.py</w:t>
+              <w:t>backend/logic/quizzes/quiz_logic.py</w:t>
             </w:r>
           </w:p>
         </w:tc>
@@ -521,7 +521,97 @@
             </w:pPr>
             <w:r>
               <w:rPr/>
-              <w:t>Quiz-specific manager, currently inheriting generic MongoDB CRUD operations.</w:t>
+              <w:t>Quiz validation, availability defaults, and MongoDB CRUD operations.</w:t>
+            </w:r>
+          </w:p>
+        </w:tc>
+      </w:tr>
+      <w:tr>
+        <w:trPr/>
+        <w:tc>
+          <w:tcPr>
+            <w:tcW w:w="3254" w:type="dxa"/>
+            <w:tcBorders/>
+            <w:vAlign w:val="center"/>
+          </w:tcPr>
+          <w:p>
+            <w:pPr>
+              <w:pStyle w:val="TableContents"/>
+              <w:bidi w:val="0"/>
+              <w:spacing w:before="120" w:after="120"/>
+              <w:jc w:val="left"/>
+              <w:rPr/>
+            </w:pPr>
+            <w:r>
+              <w:rPr>
+                <w:rStyle w:val="SourceText"/>
+              </w:rPr>
+              <w:t>backend/logic/quizzes/quiz_api.py</w:t>
+            </w:r>
+          </w:p>
+        </w:tc>
+        <w:tc>
+          <w:tcPr>
+            <w:tcW w:w="6612" w:type="dxa"/>
+            <w:tcBorders/>
+            <w:vAlign w:val="center"/>
+          </w:tcPr>
+          <w:p>
+            <w:pPr>
+              <w:pStyle w:val="TableContents"/>
+              <w:bidi w:val="0"/>
+              <w:spacing w:before="120" w:after="120"/>
+              <w:jc w:val="left"/>
+              <w:rPr/>
+            </w:pPr>
+            <w:r>
+              <w:rPr/>
+              <w:t>Quiz access rules, result retrieval, and attempt completion routes.</w:t>
+            </w:r>
+          </w:p>
+        </w:tc>
+      </w:tr>
+      <w:tr>
+        <w:trPr/>
+        <w:tc>
+          <w:tcPr>
+            <w:tcW w:w="3254" w:type="dxa"/>
+            <w:tcBorders/>
+            <w:vAlign w:val="center"/>
+          </w:tcPr>
+          <w:p>
+            <w:pPr>
+              <w:pStyle w:val="TableContents"/>
+              <w:bidi w:val="0"/>
+              <w:spacing w:before="120" w:after="120"/>
+              <w:jc w:val="left"/>
+              <w:rPr/>
+            </w:pPr>
+            <w:r>
+              <w:rPr>
+                <w:rStyle w:val="SourceText"/>
+              </w:rPr>
+              <w:t>backend/logic/users/user_admin_api.py</w:t>
+            </w:r>
+          </w:p>
+        </w:tc>
+        <w:tc>
+          <w:tcPr>
+            <w:tcW w:w="6612" w:type="dxa"/>
+            <w:tcBorders/>
+            <w:vAlign w:val="center"/>
+          </w:tcPr>
+          <w:p>
+            <w:pPr>
+              <w:pStyle w:val="TableContents"/>
+              <w:bidi w:val="0"/>
+              <w:spacing w:before="120" w:after="120"/>
+              <w:jc w:val="left"/>
+              <w:rPr/>
+            </w:pPr>
+            <w:r>
+              <w:rPr/>
+              <w:t>Admin-only user listing, role changes, and regular-user deletion routes.</w:t>
             </w:r>
           </w:p>
         </w:tc>
@@ -2226,6 +2316,71 @@
           </w:p>
         </w:tc>
       </w:tr>
+      <w:tr>
+        <w:trPr/>
+        <w:tc>
+          <w:tcPr>
+            <w:tcW w:w="1057" w:type="dxa"/>
+            <w:tcBorders/>
+            <w:vAlign w:val="center"/>
+          </w:tcPr>
+          <w:p>
+            <w:pPr>
+              <w:pStyle w:val="TableContents"/>
+              <w:bidi w:val="0"/>
+              <w:spacing w:before="120" w:after="120"/>
+              <w:jc w:val="left"/>
+              <w:rPr/>
+            </w:pPr>
+            <w:r>
+              <w:rPr/>
+              <w:t>POST</w:t>
+            </w:r>
+          </w:p>
+        </w:tc>
+        <w:tc>
+          <w:tcPr>
+            <w:tcW w:w="2278" w:type="dxa"/>
+            <w:tcBorders/>
+            <w:vAlign w:val="center"/>
+          </w:tcPr>
+          <w:p>
+            <w:pPr>
+              <w:pStyle w:val="TableContents"/>
+              <w:bidi w:val="0"/>
+              <w:spacing w:before="120" w:after="120"/>
+              <w:jc w:val="left"/>
+              <w:rPr/>
+            </w:pPr>
+            <w:r>
+              <w:rPr>
+                <w:rStyle w:val="SourceText"/>
+              </w:rPr>
+              <w:t>/api/quiz/&lt;item_id&gt;/complete</w:t>
+            </w:r>
+          </w:p>
+        </w:tc>
+        <w:tc>
+          <w:tcPr>
+            <w:tcW w:w="6029" w:type="dxa"/>
+            <w:tcBorders/>
+            <w:vAlign w:val="center"/>
+          </w:tcPr>
+          <w:p>
+            <w:pPr>
+              <w:pStyle w:val="TableContents"/>
+              <w:bidi w:val="0"/>
+              <w:spacing w:before="120" w:after="120"/>
+              <w:jc w:val="left"/>
+              <w:rPr/>
+            </w:pPr>
+            <w:r>
+              <w:rPr/>
+              <w:t>Records and returns a saved result; one attempt per user and quiz.</w:t>
+            </w:r>
+          </w:p>
+        </w:tc>
+      </w:tr>
     </w:tbl>
     <w:p>
       <w:pPr>
@@ -2238,17 +2393,17 @@
       </w:pPr>
       <w:r>
         <w:rPr/>
-        <w:t xml:space="preserve">Quiz reads are currently public. The write authorization callback is defined in </w:t>
+        <w:t xml:space="preserve">Quiz reads require a signed-in account. Regular users receive only available quizzes and never receive correct answers; admins can see all quizzes. Quiz list and detail responses include saved completion status and results. The write authorization callback checks the current Flask session against the persisted admin flag. Access control is enforced by the server, not by hiding routes or pages.</w:t>
       </w:r>
       <w:r>
         <w:rPr>
           <w:rStyle w:val="SourceText"/>
         </w:rPr>
-        <w:t>server.py</w:t>
-      </w:r>
-      <w:r>
-        <w:rPr/>
-        <w:t xml:space="preserve"> and checks the current Flask session against the persisted admin flag. Access control is enforced by the server, not by hiding routes or pages.</w:t>
+        <w:t/>
+      </w:r>
+      <w:r>
+        <w:rPr/>
+        <w:t xml:space="preserve"/>
       </w:r>
     </w:p>
     <w:p>
@@ -2556,6 +2711,51 @@
           </w:p>
         </w:tc>
       </w:tr>
+      <w:tr>
+        <w:trPr/>
+        <w:tc>
+          <w:tcPr>
+            <w:tcW w:w="1753" w:type="dxa"/>
+            <w:tcBorders/>
+            <w:vAlign w:val="center"/>
+          </w:tcPr>
+          <w:p>
+            <w:pPr>
+              <w:pStyle w:val="TableContents"/>
+              <w:bidi w:val="0"/>
+              <w:spacing w:before="120" w:after="120"/>
+              <w:jc w:val="left"/>
+              <w:rPr/>
+            </w:pPr>
+            <w:r>
+              <w:rPr>
+                <w:rStyle w:val="SourceText"/>
+              </w:rPr>
+              <w:t>quiz_attempts</w:t>
+            </w:r>
+          </w:p>
+        </w:tc>
+        <w:tc>
+          <w:tcPr>
+            <w:tcW w:w="6101" w:type="dxa"/>
+            <w:tcBorders/>
+            <w:vAlign w:val="center"/>
+          </w:tcPr>
+          <w:p>
+            <w:pPr>
+              <w:pStyle w:val="TableContents"/>
+              <w:bidi w:val="0"/>
+              <w:spacing w:before="120" w:after="120"/>
+              <w:jc w:val="left"/>
+              <w:rPr/>
+            </w:pPr>
+            <w:r>
+              <w:rPr/>
+              <w:t>Per-quiz completion records, answer review data, result, and completion time.</w:t>
+            </w:r>
+          </w:p>
+        </w:tc>
+      </w:tr>
     </w:tbl>
     <w:p>
       <w:pPr>
@@ -2895,7 +3095,7 @@
       </w:pPr>
       <w:r>
         <w:rPr/>
-        <w:t>The quiz manager currently persists quiz documents but does not implement quiz attempts. Therefore, quiz creation does not increment a user's score or completion count.</w:t>
+        <w:t>Quiz completion validates one selected choice per question and stores one attempt per user and quiz. The result includes the score and answer review; completion increments the user's score and quiz count. A second attempt is rejected with HTTP 409. Creating a quiz does not change player statistics.</w:t>
       </w:r>
     </w:p>
     <w:sectPr>

</xml_diff>